<commit_message>
docs: P1-1 P1-3 移至P4上線後優化
Made-with: Cursor
</commit_message>
<xml_diff>
--- a/docs/360醫療AI_Admin後台進度控管.docx
+++ b/docs/360醫療AI_Admin後台進度控管.docx
@@ -13671,7 +13671,7 @@
                 <w:sz w:val="17"/>
                 <w:szCs w:val="17"/>
               </w:rPr>
-              <w:t xml:space="preserve">衛福部行政處分爬蟲（診所第4維度）</w:t>
+              <w:t xml:space="preserve">衛福部行政處分爬蟲（診所第4維度）（→ P4上線後優化）</w:t>
             </w:r>
           </w:p>
         </w:tc>
@@ -13754,29 +13754,29 @@
               <w:bottom w:val="single" w:color="DDDDDD" w:sz="1"/>
               <w:right w:val="single" w:color="DDDDDD" w:sz="1"/>
             </w:tcBorders>
-            <w:shd w:fill="F1EFE8" w:val="clear"/>
-            <w:tcMar>
-              <w:top w:type="dxa" w:w="80"/>
-              <w:left w:type="dxa" w:w="80"/>
-              <w:bottom w:type="dxa" w:w="80"/>
-              <w:right w:type="dxa" w:w="80"/>
-            </w:tcMar>
-            <w:vAlign w:val="center"/>
-          </w:tcPr>
-          <w:p>
-            <w:pPr>
-              <w:jc w:val="center"/>
-            </w:pPr>
-            <w:r>
-              <w:rPr>
-                <w:rFonts w:ascii="Arial" w:cs="Arial" w:eastAsia="Arial" w:hAnsi="Arial"/>
-                <w:b/>
-                <w:bCs/>
-                <w:color w:val="5F5E5A"/>
-                <w:sz w:val="16"/>
-                <w:szCs w:val="16"/>
-              </w:rPr>
-              <w:t xml:space="preserve">待做</w:t>
+            <w:shd w:fill="FAEEDA" w:val="clear"/>
+            <w:tcMar>
+              <w:top w:type="dxa" w:w="80"/>
+              <w:left w:type="dxa" w:w="80"/>
+              <w:bottom w:type="dxa" w:w="80"/>
+              <w:right w:type="dxa" w:w="80"/>
+            </w:tcMar>
+            <w:vAlign w:val="center"/>
+          </w:tcPr>
+          <w:p>
+            <w:pPr>
+              <w:jc w:val="center"/>
+            </w:pPr>
+            <w:r>
+              <w:rPr>
+                <w:rFonts w:ascii="Arial" w:cs="Arial" w:eastAsia="Arial" w:hAnsi="Arial"/>
+                <w:b/>
+                <w:bCs/>
+                <w:color w:val="854F0B"/>
+                <w:sz w:val="16"/>
+                <w:szCs w:val="16"/>
+              </w:rPr>
+              <w:t xml:space="preserve">P4優化</w:t>
             </w:r>
           </w:p>
         </w:tc>
@@ -14012,7 +14012,7 @@
                 <w:sz w:val="17"/>
                 <w:szCs w:val="17"/>
               </w:rPr>
-              <w:t xml:space="preserve">正式網域購買+綁定</w:t>
+              <w:t xml:space="preserve">正式網域購買+綁定（→ P4上線後優化）</w:t>
             </w:r>
           </w:p>
         </w:tc>
@@ -14082,29 +14082,29 @@
               <w:bottom w:val="single" w:color="DDDDDD" w:sz="1"/>
               <w:right w:val="single" w:color="DDDDDD" w:sz="1"/>
             </w:tcBorders>
-            <w:shd w:fill="F1EFE8" w:val="clear"/>
-            <w:tcMar>
-              <w:top w:type="dxa" w:w="80"/>
-              <w:left w:type="dxa" w:w="80"/>
-              <w:bottom w:type="dxa" w:w="80"/>
-              <w:right w:type="dxa" w:w="80"/>
-            </w:tcMar>
-            <w:vAlign w:val="center"/>
-          </w:tcPr>
-          <w:p>
-            <w:pPr>
-              <w:jc w:val="center"/>
-            </w:pPr>
-            <w:r>
-              <w:rPr>
-                <w:rFonts w:ascii="Arial" w:cs="Arial" w:eastAsia="Arial" w:hAnsi="Arial"/>
-                <w:b/>
-                <w:bCs/>
-                <w:color w:val="5F5E5A"/>
-                <w:sz w:val="16"/>
-                <w:szCs w:val="16"/>
-              </w:rPr>
-              <w:t xml:space="preserve">待做</w:t>
+            <w:shd w:fill="FAEEDA" w:val="clear"/>
+            <w:tcMar>
+              <w:top w:type="dxa" w:w="80"/>
+              <w:left w:type="dxa" w:w="80"/>
+              <w:bottom w:type="dxa" w:w="80"/>
+              <w:right w:type="dxa" w:w="80"/>
+            </w:tcMar>
+            <w:vAlign w:val="center"/>
+          </w:tcPr>
+          <w:p>
+            <w:pPr>
+              <w:jc w:val="center"/>
+            </w:pPr>
+            <w:r>
+              <w:rPr>
+                <w:rFonts w:ascii="Arial" w:cs="Arial" w:eastAsia="Arial" w:hAnsi="Arial"/>
+                <w:b/>
+                <w:bCs/>
+                <w:color w:val="854F0B"/>
+                <w:sz w:val="16"/>
+                <w:szCs w:val="16"/>
+              </w:rPr>
+              <w:t xml:space="preserve">P4優化</w:t>
             </w:r>
           </w:p>
         </w:tc>

</xml_diff>